<commit_message>
work on manuscript methods.
</commit_message>
<xml_diff>
--- a/doc/working_docx_template.docx
+++ b/doc/working_docx_template.docx
@@ -1,6 +1,6 @@
 
 <file path=word/document.xml><?xml version="1.0" encoding="utf-8"?>
-<w:document xmlns:wpc="http://schemas.microsoft.com/office/word/2010/wordprocessingCanvas" xmlns:cx="http://schemas.microsoft.com/office/drawing/2014/chartex" xmlns:cx1="http://schemas.microsoft.com/office/drawing/2015/9/8/chartex" xmlns:cx2="http://schemas.microsoft.com/office/drawing/2015/10/21/chartex" xmlns:cx3="http://schemas.microsoft.com/office/drawing/2016/5/9/chartex" xmlns:cx4="http://schemas.microsoft.com/office/drawing/2016/5/10/chartex" xmlns:cx5="http://schemas.microsoft.com/office/drawing/2016/5/11/chartex" xmlns:cx6="http://schemas.microsoft.com/office/drawing/2016/5/12/chartex" xmlns:cx7="http://schemas.microsoft.com/office/drawing/2016/5/13/chartex" xmlns:cx8="http://schemas.microsoft.com/office/drawing/2016/5/14/chartex" xmlns:mc="http://schemas.openxmlformats.org/markup-compatibility/2006" xmlns:aink="http://schemas.microsoft.com/office/drawing/2016/ink" xmlns:am3d="http://schemas.microsoft.com/office/drawing/2017/model3d" xmlns:o="urn:schemas-microsoft-com:office:office" xmlns:r="http://schemas.openxmlformats.org/officeDocument/2006/relationships" xmlns:m="http://schemas.openxmlformats.org/officeDocument/2006/math" xmlns:v="urn:schemas-microsoft-com:vml" xmlns:wp14="http://schemas.microsoft.com/office/word/2010/wordprocessingDrawing" xmlns:wp="http://schemas.openxmlformats.org/drawingml/2006/wordprocessingDrawing" xmlns:w10="urn:schemas-microsoft-com:office:word" xmlns:w="http://schemas.openxmlformats.org/wordprocessingml/2006/main" xmlns:w14="http://schemas.microsoft.com/office/word/2010/wordml" xmlns:w15="http://schemas.microsoft.com/office/word/2012/wordml" xmlns:w16cid="http://schemas.microsoft.com/office/word/2016/wordml/cid" xmlns:w16se="http://schemas.microsoft.com/office/word/2015/wordml/symex" xmlns:wpg="http://schemas.microsoft.com/office/word/2010/wordprocessingGroup" xmlns:wpi="http://schemas.microsoft.com/office/word/2010/wordprocessingInk" xmlns:wne="http://schemas.microsoft.com/office/word/2006/wordml" xmlns:wps="http://schemas.microsoft.com/office/word/2010/wordprocessingShape" mc:Ignorable="w14 w15 w16se w16cid wp14">
+<w:document xmlns:wpc="http://schemas.microsoft.com/office/word/2010/wordprocessingCanvas" xmlns:cx="http://schemas.microsoft.com/office/drawing/2014/chartex" xmlns:cx1="http://schemas.microsoft.com/office/drawing/2015/9/8/chartex" xmlns:cx2="http://schemas.microsoft.com/office/drawing/2015/10/21/chartex" xmlns:cx3="http://schemas.microsoft.com/office/drawing/2016/5/9/chartex" xmlns:cx4="http://schemas.microsoft.com/office/drawing/2016/5/10/chartex" xmlns:cx5="http://schemas.microsoft.com/office/drawing/2016/5/11/chartex" xmlns:cx6="http://schemas.microsoft.com/office/drawing/2016/5/12/chartex" xmlns:cx7="http://schemas.microsoft.com/office/drawing/2016/5/13/chartex" xmlns:cx8="http://schemas.microsoft.com/office/drawing/2016/5/14/chartex" xmlns:mc="http://schemas.openxmlformats.org/markup-compatibility/2006" xmlns:aink="http://schemas.microsoft.com/office/drawing/2016/ink" xmlns:am3d="http://schemas.microsoft.com/office/drawing/2017/model3d" xmlns:o="urn:schemas-microsoft-com:office:office" xmlns:oel="http://schemas.microsoft.com/office/2019/extlst" xmlns:r="http://schemas.openxmlformats.org/officeDocument/2006/relationships" xmlns:m="http://schemas.openxmlformats.org/officeDocument/2006/math" xmlns:v="urn:schemas-microsoft-com:vml" xmlns:wp14="http://schemas.microsoft.com/office/word/2010/wordprocessingDrawing" xmlns:wp="http://schemas.openxmlformats.org/drawingml/2006/wordprocessingDrawing" xmlns:w10="urn:schemas-microsoft-com:office:word" xmlns:w="http://schemas.openxmlformats.org/wordprocessingml/2006/main" xmlns:w14="http://schemas.microsoft.com/office/word/2010/wordml" xmlns:w15="http://schemas.microsoft.com/office/word/2012/wordml" xmlns:w16cex="http://schemas.microsoft.com/office/word/2018/wordml/cex" xmlns:w16cid="http://schemas.microsoft.com/office/word/2016/wordml/cid" xmlns:w16="http://schemas.microsoft.com/office/word/2018/wordml" xmlns:w16du="http://schemas.microsoft.com/office/word/2023/wordml/word16du" xmlns:w16sdtdh="http://schemas.microsoft.com/office/word/2020/wordml/sdtdatahash" xmlns:w16sdtfl="http://schemas.microsoft.com/office/word/2024/wordml/sdtformatlock" xmlns:w16se="http://schemas.microsoft.com/office/word/2015/wordml/symex" xmlns:wpg="http://schemas.microsoft.com/office/word/2010/wordprocessingGroup" xmlns:wpi="http://schemas.microsoft.com/office/word/2010/wordprocessingInk" xmlns:wne="http://schemas.microsoft.com/office/word/2006/wordml" xmlns:wps="http://schemas.microsoft.com/office/word/2010/wordprocessingShape" mc:Ignorable="w14 w15 w16se w16cid w16 w16cex w16sdtdh w16sdtfl w16du wp14">
   <w:body>
     <w:p>
       <w:pPr>
@@ -36,22 +36,14 @@
         <w:rPr>
           <w:rFonts w:cs="Times New Roman"/>
         </w:rPr>
-        <w:t>11/16</w:t>
-      </w:r>
-      <w:bookmarkStart w:id="0" w:name="_GoBack"/>
-      <w:bookmarkEnd w:id="0"/>
-      <w:r>
-        <w:rPr>
-          <w:rFonts w:cs="Times New Roman"/>
-        </w:rPr>
-        <w:t>/2021</w:t>
+        <w:t>11/16/2021</w:t>
       </w:r>
     </w:p>
     <w:p>
       <w:pPr>
         <w:pStyle w:val="Heading1"/>
       </w:pPr>
-      <w:bookmarkStart w:id="1" w:name="heading-1"/>
+      <w:bookmarkStart w:id="0" w:name="heading-1"/>
       <w:r>
         <w:t>Heading 1</w:t>
       </w:r>
@@ -69,22 +61,14 @@
         <w:pStyle w:val="BodyText"/>
       </w:pPr>
       <w:r>
-        <w:t xml:space="preserve">Here is a new paragraph. One of the more frustrating aspects of this current workflow is the inability to indent new paragraphs. If/when this is figured out, you should update the Markdown file to allow this. </w:t>
-      </w:r>
-      <w:proofErr w:type="gramStart"/>
-      <w:r>
-        <w:t>Of course</w:t>
-      </w:r>
-      <w:proofErr w:type="gramEnd"/>
-      <w:r>
-        <w:t xml:space="preserve"> this is a very minor adjustment.</w:t>
+        <w:t>Here is a new paragraph. One of the more frustrating aspects of this current workflow is the inability to indent new paragraphs. If/when this is figured out, you should update the Markdown file to allow this. Of course this is a very minor adjustment.</w:t>
       </w:r>
     </w:p>
     <w:p>
       <w:pPr>
         <w:pStyle w:val="Heading2"/>
       </w:pPr>
-      <w:bookmarkStart w:id="2" w:name="heading-2"/>
+      <w:bookmarkStart w:id="1" w:name="heading-2"/>
       <w:r>
         <w:t>Heading 2</w:t>
       </w:r>
@@ -124,7 +108,7 @@
       <w:pPr>
         <w:pStyle w:val="Heading3"/>
       </w:pPr>
-      <w:bookmarkStart w:id="3" w:name="heading-3"/>
+      <w:bookmarkStart w:id="2" w:name="heading-3"/>
       <w:r>
         <w:t>Heading 3</w:t>
       </w:r>
@@ -201,7 +185,7 @@
       <w:pPr>
         <w:pStyle w:val="Heading4"/>
       </w:pPr>
-      <w:bookmarkStart w:id="4" w:name="heading-4"/>
+      <w:bookmarkStart w:id="3" w:name="heading-4"/>
       <w:r>
         <w:lastRenderedPageBreak/>
         <w:t>Heading 4</w:t>
@@ -243,7 +227,7 @@
       <w:pPr>
         <w:pStyle w:val="Heading5"/>
       </w:pPr>
-      <w:bookmarkStart w:id="5" w:name="heading-5"/>
+      <w:bookmarkStart w:id="4" w:name="heading-5"/>
       <w:r>
         <w:t>Heading 5</w:t>
       </w:r>
@@ -436,6 +420,51 @@
     </w:p>
     <w:p>
       <w:pPr>
+        <w:pStyle w:val="text-box"/>
+      </w:pPr>
+      <w:r>
+        <w:t xml:space="preserve">Box 1. If you need text in a </w:t>
+      </w:r>
+      <w:proofErr w:type="gramStart"/>
+      <w:r>
+        <w:t>box</w:t>
+      </w:r>
+      <w:proofErr w:type="gramEnd"/>
+      <w:r>
+        <w:t xml:space="preserve"> you can use the custom-style=”</w:t>
+      </w:r>
+      <w:proofErr w:type="gramStart"/>
+      <w:r>
+        <w:t>text-box</w:t>
+      </w:r>
+      <w:proofErr w:type="gramEnd"/>
+      <w:r>
+        <w:t xml:space="preserve">” format in the chunk header using the division </w:t>
+      </w:r>
+      <w:proofErr w:type="gramStart"/>
+      <w:r>
+        <w:t>marker :::{</w:t>
+      </w:r>
+      <w:proofErr w:type="gramEnd"/>
+      <w:r>
+        <w:t>custom-style=”</w:t>
+      </w:r>
+      <w:proofErr w:type="gramStart"/>
+      <w:r>
+        <w:t>text-box</w:t>
+      </w:r>
+      <w:proofErr w:type="gramEnd"/>
+      <w:r>
+        <w:t>”}</w:t>
+      </w:r>
+    </w:p>
+    <w:p>
+      <w:pPr>
+        <w:pStyle w:val="FirstParagraph"/>
+      </w:pPr>
+    </w:p>
+    <w:p>
+      <w:pPr>
         <w:pStyle w:val="FirstParagraph"/>
       </w:pPr>
       <w:r>
@@ -449,7 +478,15 @@
         <w:t>Knit</w:t>
       </w:r>
       <w:r>
-        <w:t xml:space="preserve"> button a document will be generated that includes both content as well as the output of any embedded R code chunks within the document. You can embed an R code chunk like this:</w:t>
+        <w:t xml:space="preserve"> </w:t>
+      </w:r>
+      <w:proofErr w:type="gramStart"/>
+      <w:r>
+        <w:t>button</w:t>
+      </w:r>
+      <w:proofErr w:type="gramEnd"/>
+      <w:r>
+        <w:t xml:space="preserve"> a document will be generated that includes both content as well as the output of any embedded R code chunks within the document. You can embed an R code chunk like this:</w:t>
       </w:r>
     </w:p>
     <w:p>
@@ -474,11 +511,17 @@
       <w:r>
         <w:t xml:space="preserve"> parameter was added to the code chunk to prevent printing of the R code that generated the plot.</w:t>
       </w:r>
+      <w:bookmarkEnd w:id="0"/>
       <w:bookmarkEnd w:id="1"/>
       <w:bookmarkEnd w:id="2"/>
       <w:bookmarkEnd w:id="3"/>
       <w:bookmarkEnd w:id="4"/>
-      <w:bookmarkEnd w:id="5"/>
+    </w:p>
+    <w:p>
+      <w:pPr>
+        <w:pStyle w:val="SourceCode"/>
+        <w:ind w:firstLine="0"/>
+      </w:pPr>
     </w:p>
     <w:sectPr>
       <w:headerReference w:type="even" r:id="rId8"/>
@@ -498,7 +541,7 @@
 </file>
 
 <file path=word/endnotes.xml><?xml version="1.0" encoding="utf-8"?>
-<w:endnotes xmlns:wpc="http://schemas.microsoft.com/office/word/2010/wordprocessingCanvas" xmlns:cx="http://schemas.microsoft.com/office/drawing/2014/chartex" xmlns:cx1="http://schemas.microsoft.com/office/drawing/2015/9/8/chartex" xmlns:cx2="http://schemas.microsoft.com/office/drawing/2015/10/21/chartex" xmlns:cx3="http://schemas.microsoft.com/office/drawing/2016/5/9/chartex" xmlns:cx4="http://schemas.microsoft.com/office/drawing/2016/5/10/chartex" xmlns:cx5="http://schemas.microsoft.com/office/drawing/2016/5/11/chartex" xmlns:cx6="http://schemas.microsoft.com/office/drawing/2016/5/12/chartex" xmlns:cx7="http://schemas.microsoft.com/office/drawing/2016/5/13/chartex" xmlns:cx8="http://schemas.microsoft.com/office/drawing/2016/5/14/chartex" xmlns:mc="http://schemas.openxmlformats.org/markup-compatibility/2006" xmlns:aink="http://schemas.microsoft.com/office/drawing/2016/ink" xmlns:am3d="http://schemas.microsoft.com/office/drawing/2017/model3d" xmlns:o="urn:schemas-microsoft-com:office:office" xmlns:r="http://schemas.openxmlformats.org/officeDocument/2006/relationships" xmlns:m="http://schemas.openxmlformats.org/officeDocument/2006/math" xmlns:v="urn:schemas-microsoft-com:vml" xmlns:wp14="http://schemas.microsoft.com/office/word/2010/wordprocessingDrawing" xmlns:wp="http://schemas.openxmlformats.org/drawingml/2006/wordprocessingDrawing" xmlns:w10="urn:schemas-microsoft-com:office:word" xmlns:w="http://schemas.openxmlformats.org/wordprocessingml/2006/main" xmlns:w14="http://schemas.microsoft.com/office/word/2010/wordml" xmlns:w15="http://schemas.microsoft.com/office/word/2012/wordml" xmlns:w16cid="http://schemas.microsoft.com/office/word/2016/wordml/cid" xmlns:w16se="http://schemas.microsoft.com/office/word/2015/wordml/symex" xmlns:wpg="http://schemas.microsoft.com/office/word/2010/wordprocessingGroup" xmlns:wpi="http://schemas.microsoft.com/office/word/2010/wordprocessingInk" xmlns:wne="http://schemas.microsoft.com/office/word/2006/wordml" xmlns:wps="http://schemas.microsoft.com/office/word/2010/wordprocessingShape" mc:Ignorable="w14 w15 w16se w16cid wp14">
+<w:endnotes xmlns:wpc="http://schemas.microsoft.com/office/word/2010/wordprocessingCanvas" xmlns:cx="http://schemas.microsoft.com/office/drawing/2014/chartex" xmlns:cx1="http://schemas.microsoft.com/office/drawing/2015/9/8/chartex" xmlns:cx2="http://schemas.microsoft.com/office/drawing/2015/10/21/chartex" xmlns:cx3="http://schemas.microsoft.com/office/drawing/2016/5/9/chartex" xmlns:cx4="http://schemas.microsoft.com/office/drawing/2016/5/10/chartex" xmlns:cx5="http://schemas.microsoft.com/office/drawing/2016/5/11/chartex" xmlns:cx6="http://schemas.microsoft.com/office/drawing/2016/5/12/chartex" xmlns:cx7="http://schemas.microsoft.com/office/drawing/2016/5/13/chartex" xmlns:cx8="http://schemas.microsoft.com/office/drawing/2016/5/14/chartex" xmlns:mc="http://schemas.openxmlformats.org/markup-compatibility/2006" xmlns:aink="http://schemas.microsoft.com/office/drawing/2016/ink" xmlns:am3d="http://schemas.microsoft.com/office/drawing/2017/model3d" xmlns:o="urn:schemas-microsoft-com:office:office" xmlns:oel="http://schemas.microsoft.com/office/2019/extlst" xmlns:r="http://schemas.openxmlformats.org/officeDocument/2006/relationships" xmlns:m="http://schemas.openxmlformats.org/officeDocument/2006/math" xmlns:v="urn:schemas-microsoft-com:vml" xmlns:wp14="http://schemas.microsoft.com/office/word/2010/wordprocessingDrawing" xmlns:wp="http://schemas.openxmlformats.org/drawingml/2006/wordprocessingDrawing" xmlns:w10="urn:schemas-microsoft-com:office:word" xmlns:w="http://schemas.openxmlformats.org/wordprocessingml/2006/main" xmlns:w14="http://schemas.microsoft.com/office/word/2010/wordml" xmlns:w15="http://schemas.microsoft.com/office/word/2012/wordml" xmlns:w16cex="http://schemas.microsoft.com/office/word/2018/wordml/cex" xmlns:w16cid="http://schemas.microsoft.com/office/word/2016/wordml/cid" xmlns:w16="http://schemas.microsoft.com/office/word/2018/wordml" xmlns:w16du="http://schemas.microsoft.com/office/word/2023/wordml/word16du" xmlns:w16sdtdh="http://schemas.microsoft.com/office/word/2020/wordml/sdtdatahash" xmlns:w16sdtfl="http://schemas.microsoft.com/office/word/2024/wordml/sdtformatlock" xmlns:w16se="http://schemas.microsoft.com/office/word/2015/wordml/symex" xmlns:wpg="http://schemas.microsoft.com/office/word/2010/wordprocessingGroup" xmlns:wpi="http://schemas.microsoft.com/office/word/2010/wordprocessingInk" xmlns:wne="http://schemas.microsoft.com/office/word/2006/wordml" xmlns:wps="http://schemas.microsoft.com/office/word/2010/wordprocessingShape" mc:Ignorable="w14 w15 w16se w16cid w16 w16cex w16sdtdh w16sdtfl w16du wp14">
   <w:endnote w:type="separator" w:id="-1">
     <w:p>
       <w:pPr>
@@ -523,7 +566,7 @@
 </file>
 
 <file path=word/footer1.xml><?xml version="1.0" encoding="utf-8"?>
-<w:ftr xmlns:wpc="http://schemas.microsoft.com/office/word/2010/wordprocessingCanvas" xmlns:cx="http://schemas.microsoft.com/office/drawing/2014/chartex" xmlns:cx1="http://schemas.microsoft.com/office/drawing/2015/9/8/chartex" xmlns:cx2="http://schemas.microsoft.com/office/drawing/2015/10/21/chartex" xmlns:cx3="http://schemas.microsoft.com/office/drawing/2016/5/9/chartex" xmlns:cx4="http://schemas.microsoft.com/office/drawing/2016/5/10/chartex" xmlns:cx5="http://schemas.microsoft.com/office/drawing/2016/5/11/chartex" xmlns:cx6="http://schemas.microsoft.com/office/drawing/2016/5/12/chartex" xmlns:cx7="http://schemas.microsoft.com/office/drawing/2016/5/13/chartex" xmlns:cx8="http://schemas.microsoft.com/office/drawing/2016/5/14/chartex" xmlns:mc="http://schemas.openxmlformats.org/markup-compatibility/2006" xmlns:aink="http://schemas.microsoft.com/office/drawing/2016/ink" xmlns:am3d="http://schemas.microsoft.com/office/drawing/2017/model3d" xmlns:o="urn:schemas-microsoft-com:office:office" xmlns:r="http://schemas.openxmlformats.org/officeDocument/2006/relationships" xmlns:m="http://schemas.openxmlformats.org/officeDocument/2006/math" xmlns:v="urn:schemas-microsoft-com:vml" xmlns:wp14="http://schemas.microsoft.com/office/word/2010/wordprocessingDrawing" xmlns:wp="http://schemas.openxmlformats.org/drawingml/2006/wordprocessingDrawing" xmlns:w10="urn:schemas-microsoft-com:office:word" xmlns:w="http://schemas.openxmlformats.org/wordprocessingml/2006/main" xmlns:w14="http://schemas.microsoft.com/office/word/2010/wordml" xmlns:w15="http://schemas.microsoft.com/office/word/2012/wordml" xmlns:w16cid="http://schemas.microsoft.com/office/word/2016/wordml/cid" xmlns:w16se="http://schemas.microsoft.com/office/word/2015/wordml/symex" xmlns:wpg="http://schemas.microsoft.com/office/word/2010/wordprocessingGroup" xmlns:wpi="http://schemas.microsoft.com/office/word/2010/wordprocessingInk" xmlns:wne="http://schemas.microsoft.com/office/word/2006/wordml" xmlns:wps="http://schemas.microsoft.com/office/word/2010/wordprocessingShape" mc:Ignorable="w14 w15 w16se w16cid wp14">
+<w:ftr xmlns:wpc="http://schemas.microsoft.com/office/word/2010/wordprocessingCanvas" xmlns:cx="http://schemas.microsoft.com/office/drawing/2014/chartex" xmlns:cx1="http://schemas.microsoft.com/office/drawing/2015/9/8/chartex" xmlns:cx2="http://schemas.microsoft.com/office/drawing/2015/10/21/chartex" xmlns:cx3="http://schemas.microsoft.com/office/drawing/2016/5/9/chartex" xmlns:cx4="http://schemas.microsoft.com/office/drawing/2016/5/10/chartex" xmlns:cx5="http://schemas.microsoft.com/office/drawing/2016/5/11/chartex" xmlns:cx6="http://schemas.microsoft.com/office/drawing/2016/5/12/chartex" xmlns:cx7="http://schemas.microsoft.com/office/drawing/2016/5/13/chartex" xmlns:cx8="http://schemas.microsoft.com/office/drawing/2016/5/14/chartex" xmlns:mc="http://schemas.openxmlformats.org/markup-compatibility/2006" xmlns:aink="http://schemas.microsoft.com/office/drawing/2016/ink" xmlns:am3d="http://schemas.microsoft.com/office/drawing/2017/model3d" xmlns:o="urn:schemas-microsoft-com:office:office" xmlns:oel="http://schemas.microsoft.com/office/2019/extlst" xmlns:r="http://schemas.openxmlformats.org/officeDocument/2006/relationships" xmlns:m="http://schemas.openxmlformats.org/officeDocument/2006/math" xmlns:v="urn:schemas-microsoft-com:vml" xmlns:wp14="http://schemas.microsoft.com/office/word/2010/wordprocessingDrawing" xmlns:wp="http://schemas.openxmlformats.org/drawingml/2006/wordprocessingDrawing" xmlns:w10="urn:schemas-microsoft-com:office:word" xmlns:w="http://schemas.openxmlformats.org/wordprocessingml/2006/main" xmlns:w14="http://schemas.microsoft.com/office/word/2010/wordml" xmlns:w15="http://schemas.microsoft.com/office/word/2012/wordml" xmlns:w16cex="http://schemas.microsoft.com/office/word/2018/wordml/cex" xmlns:w16cid="http://schemas.microsoft.com/office/word/2016/wordml/cid" xmlns:w16="http://schemas.microsoft.com/office/word/2018/wordml" xmlns:w16du="http://schemas.microsoft.com/office/word/2023/wordml/word16du" xmlns:w16sdtdh="http://schemas.microsoft.com/office/word/2020/wordml/sdtdatahash" xmlns:w16sdtfl="http://schemas.microsoft.com/office/word/2024/wordml/sdtformatlock" xmlns:w16se="http://schemas.microsoft.com/office/word/2015/wordml/symex" xmlns:wpg="http://schemas.microsoft.com/office/word/2010/wordprocessingGroup" xmlns:wpi="http://schemas.microsoft.com/office/word/2010/wordprocessingInk" xmlns:wne="http://schemas.microsoft.com/office/word/2006/wordml" xmlns:wps="http://schemas.microsoft.com/office/word/2010/wordprocessingShape" mc:Ignorable="w14 w15 w16se w16cid w16 w16cex w16sdtdh w16sdtfl w16du wp14">
   <w:p>
     <w:pPr>
       <w:pStyle w:val="Footer"/>
@@ -533,7 +576,7 @@
 </file>
 
 <file path=word/footer2.xml><?xml version="1.0" encoding="utf-8"?>
-<w:ftr xmlns:wpc="http://schemas.microsoft.com/office/word/2010/wordprocessingCanvas" xmlns:cx="http://schemas.microsoft.com/office/drawing/2014/chartex" xmlns:cx1="http://schemas.microsoft.com/office/drawing/2015/9/8/chartex" xmlns:cx2="http://schemas.microsoft.com/office/drawing/2015/10/21/chartex" xmlns:cx3="http://schemas.microsoft.com/office/drawing/2016/5/9/chartex" xmlns:cx4="http://schemas.microsoft.com/office/drawing/2016/5/10/chartex" xmlns:cx5="http://schemas.microsoft.com/office/drawing/2016/5/11/chartex" xmlns:cx6="http://schemas.microsoft.com/office/drawing/2016/5/12/chartex" xmlns:cx7="http://schemas.microsoft.com/office/drawing/2016/5/13/chartex" xmlns:cx8="http://schemas.microsoft.com/office/drawing/2016/5/14/chartex" xmlns:mc="http://schemas.openxmlformats.org/markup-compatibility/2006" xmlns:aink="http://schemas.microsoft.com/office/drawing/2016/ink" xmlns:am3d="http://schemas.microsoft.com/office/drawing/2017/model3d" xmlns:o="urn:schemas-microsoft-com:office:office" xmlns:r="http://schemas.openxmlformats.org/officeDocument/2006/relationships" xmlns:m="http://schemas.openxmlformats.org/officeDocument/2006/math" xmlns:v="urn:schemas-microsoft-com:vml" xmlns:wp14="http://schemas.microsoft.com/office/word/2010/wordprocessingDrawing" xmlns:wp="http://schemas.openxmlformats.org/drawingml/2006/wordprocessingDrawing" xmlns:w10="urn:schemas-microsoft-com:office:word" xmlns:w="http://schemas.openxmlformats.org/wordprocessingml/2006/main" xmlns:w14="http://schemas.microsoft.com/office/word/2010/wordml" xmlns:w15="http://schemas.microsoft.com/office/word/2012/wordml" xmlns:w16cid="http://schemas.microsoft.com/office/word/2016/wordml/cid" xmlns:w16se="http://schemas.microsoft.com/office/word/2015/wordml/symex" xmlns:wpg="http://schemas.microsoft.com/office/word/2010/wordprocessingGroup" xmlns:wpi="http://schemas.microsoft.com/office/word/2010/wordprocessingInk" xmlns:wne="http://schemas.microsoft.com/office/word/2006/wordml" xmlns:wps="http://schemas.microsoft.com/office/word/2010/wordprocessingShape" mc:Ignorable="w14 w15 w16se w16cid wp14">
+<w:ftr xmlns:wpc="http://schemas.microsoft.com/office/word/2010/wordprocessingCanvas" xmlns:cx="http://schemas.microsoft.com/office/drawing/2014/chartex" xmlns:cx1="http://schemas.microsoft.com/office/drawing/2015/9/8/chartex" xmlns:cx2="http://schemas.microsoft.com/office/drawing/2015/10/21/chartex" xmlns:cx3="http://schemas.microsoft.com/office/drawing/2016/5/9/chartex" xmlns:cx4="http://schemas.microsoft.com/office/drawing/2016/5/10/chartex" xmlns:cx5="http://schemas.microsoft.com/office/drawing/2016/5/11/chartex" xmlns:cx6="http://schemas.microsoft.com/office/drawing/2016/5/12/chartex" xmlns:cx7="http://schemas.microsoft.com/office/drawing/2016/5/13/chartex" xmlns:cx8="http://schemas.microsoft.com/office/drawing/2016/5/14/chartex" xmlns:mc="http://schemas.openxmlformats.org/markup-compatibility/2006" xmlns:aink="http://schemas.microsoft.com/office/drawing/2016/ink" xmlns:am3d="http://schemas.microsoft.com/office/drawing/2017/model3d" xmlns:o="urn:schemas-microsoft-com:office:office" xmlns:oel="http://schemas.microsoft.com/office/2019/extlst" xmlns:r="http://schemas.openxmlformats.org/officeDocument/2006/relationships" xmlns:m="http://schemas.openxmlformats.org/officeDocument/2006/math" xmlns:v="urn:schemas-microsoft-com:vml" xmlns:wp14="http://schemas.microsoft.com/office/word/2010/wordprocessingDrawing" xmlns:wp="http://schemas.openxmlformats.org/drawingml/2006/wordprocessingDrawing" xmlns:w10="urn:schemas-microsoft-com:office:word" xmlns:w="http://schemas.openxmlformats.org/wordprocessingml/2006/main" xmlns:w14="http://schemas.microsoft.com/office/word/2010/wordml" xmlns:w15="http://schemas.microsoft.com/office/word/2012/wordml" xmlns:w16cex="http://schemas.microsoft.com/office/word/2018/wordml/cex" xmlns:w16cid="http://schemas.microsoft.com/office/word/2016/wordml/cid" xmlns:w16="http://schemas.microsoft.com/office/word/2018/wordml" xmlns:w16du="http://schemas.microsoft.com/office/word/2023/wordml/word16du" xmlns:w16sdtdh="http://schemas.microsoft.com/office/word/2020/wordml/sdtdatahash" xmlns:w16sdtfl="http://schemas.microsoft.com/office/word/2024/wordml/sdtformatlock" xmlns:w16se="http://schemas.microsoft.com/office/word/2015/wordml/symex" xmlns:wpg="http://schemas.microsoft.com/office/word/2010/wordprocessingGroup" xmlns:wpi="http://schemas.microsoft.com/office/word/2010/wordprocessingInk" xmlns:wne="http://schemas.microsoft.com/office/word/2006/wordml" xmlns:wps="http://schemas.microsoft.com/office/word/2010/wordprocessingShape" mc:Ignorable="w14 w15 w16se w16cid w16 w16cex w16sdtdh w16sdtfl w16du wp14">
   <w:p>
     <w:pPr>
       <w:pStyle w:val="Footer"/>
@@ -543,7 +586,7 @@
 </file>
 
 <file path=word/footer3.xml><?xml version="1.0" encoding="utf-8"?>
-<w:ftr xmlns:wpc="http://schemas.microsoft.com/office/word/2010/wordprocessingCanvas" xmlns:cx="http://schemas.microsoft.com/office/drawing/2014/chartex" xmlns:cx1="http://schemas.microsoft.com/office/drawing/2015/9/8/chartex" xmlns:cx2="http://schemas.microsoft.com/office/drawing/2015/10/21/chartex" xmlns:cx3="http://schemas.microsoft.com/office/drawing/2016/5/9/chartex" xmlns:cx4="http://schemas.microsoft.com/office/drawing/2016/5/10/chartex" xmlns:cx5="http://schemas.microsoft.com/office/drawing/2016/5/11/chartex" xmlns:cx6="http://schemas.microsoft.com/office/drawing/2016/5/12/chartex" xmlns:cx7="http://schemas.microsoft.com/office/drawing/2016/5/13/chartex" xmlns:cx8="http://schemas.microsoft.com/office/drawing/2016/5/14/chartex" xmlns:mc="http://schemas.openxmlformats.org/markup-compatibility/2006" xmlns:aink="http://schemas.microsoft.com/office/drawing/2016/ink" xmlns:am3d="http://schemas.microsoft.com/office/drawing/2017/model3d" xmlns:o="urn:schemas-microsoft-com:office:office" xmlns:r="http://schemas.openxmlformats.org/officeDocument/2006/relationships" xmlns:m="http://schemas.openxmlformats.org/officeDocument/2006/math" xmlns:v="urn:schemas-microsoft-com:vml" xmlns:wp14="http://schemas.microsoft.com/office/word/2010/wordprocessingDrawing" xmlns:wp="http://schemas.openxmlformats.org/drawingml/2006/wordprocessingDrawing" xmlns:w10="urn:schemas-microsoft-com:office:word" xmlns:w="http://schemas.openxmlformats.org/wordprocessingml/2006/main" xmlns:w14="http://schemas.microsoft.com/office/word/2010/wordml" xmlns:w15="http://schemas.microsoft.com/office/word/2012/wordml" xmlns:w16cid="http://schemas.microsoft.com/office/word/2016/wordml/cid" xmlns:w16se="http://schemas.microsoft.com/office/word/2015/wordml/symex" xmlns:wpg="http://schemas.microsoft.com/office/word/2010/wordprocessingGroup" xmlns:wpi="http://schemas.microsoft.com/office/word/2010/wordprocessingInk" xmlns:wne="http://schemas.microsoft.com/office/word/2006/wordml" xmlns:wps="http://schemas.microsoft.com/office/word/2010/wordprocessingShape" mc:Ignorable="w14 w15 w16se w16cid wp14">
+<w:ftr xmlns:wpc="http://schemas.microsoft.com/office/word/2010/wordprocessingCanvas" xmlns:cx="http://schemas.microsoft.com/office/drawing/2014/chartex" xmlns:cx1="http://schemas.microsoft.com/office/drawing/2015/9/8/chartex" xmlns:cx2="http://schemas.microsoft.com/office/drawing/2015/10/21/chartex" xmlns:cx3="http://schemas.microsoft.com/office/drawing/2016/5/9/chartex" xmlns:cx4="http://schemas.microsoft.com/office/drawing/2016/5/10/chartex" xmlns:cx5="http://schemas.microsoft.com/office/drawing/2016/5/11/chartex" xmlns:cx6="http://schemas.microsoft.com/office/drawing/2016/5/12/chartex" xmlns:cx7="http://schemas.microsoft.com/office/drawing/2016/5/13/chartex" xmlns:cx8="http://schemas.microsoft.com/office/drawing/2016/5/14/chartex" xmlns:mc="http://schemas.openxmlformats.org/markup-compatibility/2006" xmlns:aink="http://schemas.microsoft.com/office/drawing/2016/ink" xmlns:am3d="http://schemas.microsoft.com/office/drawing/2017/model3d" xmlns:o="urn:schemas-microsoft-com:office:office" xmlns:oel="http://schemas.microsoft.com/office/2019/extlst" xmlns:r="http://schemas.openxmlformats.org/officeDocument/2006/relationships" xmlns:m="http://schemas.openxmlformats.org/officeDocument/2006/math" xmlns:v="urn:schemas-microsoft-com:vml" xmlns:wp14="http://schemas.microsoft.com/office/word/2010/wordprocessingDrawing" xmlns:wp="http://schemas.openxmlformats.org/drawingml/2006/wordprocessingDrawing" xmlns:w10="urn:schemas-microsoft-com:office:word" xmlns:w="http://schemas.openxmlformats.org/wordprocessingml/2006/main" xmlns:w14="http://schemas.microsoft.com/office/word/2010/wordml" xmlns:w15="http://schemas.microsoft.com/office/word/2012/wordml" xmlns:w16cex="http://schemas.microsoft.com/office/word/2018/wordml/cex" xmlns:w16cid="http://schemas.microsoft.com/office/word/2016/wordml/cid" xmlns:w16="http://schemas.microsoft.com/office/word/2018/wordml" xmlns:w16du="http://schemas.microsoft.com/office/word/2023/wordml/word16du" xmlns:w16sdtdh="http://schemas.microsoft.com/office/word/2020/wordml/sdtdatahash" xmlns:w16sdtfl="http://schemas.microsoft.com/office/word/2024/wordml/sdtformatlock" xmlns:w16se="http://schemas.microsoft.com/office/word/2015/wordml/symex" xmlns:wpg="http://schemas.microsoft.com/office/word/2010/wordprocessingGroup" xmlns:wpi="http://schemas.microsoft.com/office/word/2010/wordprocessingInk" xmlns:wne="http://schemas.microsoft.com/office/word/2006/wordml" xmlns:wps="http://schemas.microsoft.com/office/word/2010/wordprocessingShape" mc:Ignorable="w14 w15 w16se w16cid w16 w16cex w16sdtdh w16sdtfl w16du wp14">
   <w:p>
     <w:pPr>
       <w:pStyle w:val="Footer"/>
@@ -553,7 +596,7 @@
 </file>
 
 <file path=word/footnotes.xml><?xml version="1.0" encoding="utf-8"?>
-<w:footnotes xmlns:wpc="http://schemas.microsoft.com/office/word/2010/wordprocessingCanvas" xmlns:cx="http://schemas.microsoft.com/office/drawing/2014/chartex" xmlns:cx1="http://schemas.microsoft.com/office/drawing/2015/9/8/chartex" xmlns:cx2="http://schemas.microsoft.com/office/drawing/2015/10/21/chartex" xmlns:cx3="http://schemas.microsoft.com/office/drawing/2016/5/9/chartex" xmlns:cx4="http://schemas.microsoft.com/office/drawing/2016/5/10/chartex" xmlns:cx5="http://schemas.microsoft.com/office/drawing/2016/5/11/chartex" xmlns:cx6="http://schemas.microsoft.com/office/drawing/2016/5/12/chartex" xmlns:cx7="http://schemas.microsoft.com/office/drawing/2016/5/13/chartex" xmlns:cx8="http://schemas.microsoft.com/office/drawing/2016/5/14/chartex" xmlns:mc="http://schemas.openxmlformats.org/markup-compatibility/2006" xmlns:aink="http://schemas.microsoft.com/office/drawing/2016/ink" xmlns:am3d="http://schemas.microsoft.com/office/drawing/2017/model3d" xmlns:o="urn:schemas-microsoft-com:office:office" xmlns:r="http://schemas.openxmlformats.org/officeDocument/2006/relationships" xmlns:m="http://schemas.openxmlformats.org/officeDocument/2006/math" xmlns:v="urn:schemas-microsoft-com:vml" xmlns:wp14="http://schemas.microsoft.com/office/word/2010/wordprocessingDrawing" xmlns:wp="http://schemas.openxmlformats.org/drawingml/2006/wordprocessingDrawing" xmlns:w10="urn:schemas-microsoft-com:office:word" xmlns:w="http://schemas.openxmlformats.org/wordprocessingml/2006/main" xmlns:w14="http://schemas.microsoft.com/office/word/2010/wordml" xmlns:w15="http://schemas.microsoft.com/office/word/2012/wordml" xmlns:w16cid="http://schemas.microsoft.com/office/word/2016/wordml/cid" xmlns:w16se="http://schemas.microsoft.com/office/word/2015/wordml/symex" xmlns:wpg="http://schemas.microsoft.com/office/word/2010/wordprocessingGroup" xmlns:wpi="http://schemas.microsoft.com/office/word/2010/wordprocessingInk" xmlns:wne="http://schemas.microsoft.com/office/word/2006/wordml" xmlns:wps="http://schemas.microsoft.com/office/word/2010/wordprocessingShape" mc:Ignorable="w14 w15 w16se w16cid wp14">
+<w:footnotes xmlns:wpc="http://schemas.microsoft.com/office/word/2010/wordprocessingCanvas" xmlns:cx="http://schemas.microsoft.com/office/drawing/2014/chartex" xmlns:cx1="http://schemas.microsoft.com/office/drawing/2015/9/8/chartex" xmlns:cx2="http://schemas.microsoft.com/office/drawing/2015/10/21/chartex" xmlns:cx3="http://schemas.microsoft.com/office/drawing/2016/5/9/chartex" xmlns:cx4="http://schemas.microsoft.com/office/drawing/2016/5/10/chartex" xmlns:cx5="http://schemas.microsoft.com/office/drawing/2016/5/11/chartex" xmlns:cx6="http://schemas.microsoft.com/office/drawing/2016/5/12/chartex" xmlns:cx7="http://schemas.microsoft.com/office/drawing/2016/5/13/chartex" xmlns:cx8="http://schemas.microsoft.com/office/drawing/2016/5/14/chartex" xmlns:mc="http://schemas.openxmlformats.org/markup-compatibility/2006" xmlns:aink="http://schemas.microsoft.com/office/drawing/2016/ink" xmlns:am3d="http://schemas.microsoft.com/office/drawing/2017/model3d" xmlns:o="urn:schemas-microsoft-com:office:office" xmlns:oel="http://schemas.microsoft.com/office/2019/extlst" xmlns:r="http://schemas.openxmlformats.org/officeDocument/2006/relationships" xmlns:m="http://schemas.openxmlformats.org/officeDocument/2006/math" xmlns:v="urn:schemas-microsoft-com:vml" xmlns:wp14="http://schemas.microsoft.com/office/word/2010/wordprocessingDrawing" xmlns:wp="http://schemas.openxmlformats.org/drawingml/2006/wordprocessingDrawing" xmlns:w10="urn:schemas-microsoft-com:office:word" xmlns:w="http://schemas.openxmlformats.org/wordprocessingml/2006/main" xmlns:w14="http://schemas.microsoft.com/office/word/2010/wordml" xmlns:w15="http://schemas.microsoft.com/office/word/2012/wordml" xmlns:w16cex="http://schemas.microsoft.com/office/word/2018/wordml/cex" xmlns:w16cid="http://schemas.microsoft.com/office/word/2016/wordml/cid" xmlns:w16="http://schemas.microsoft.com/office/word/2018/wordml" xmlns:w16du="http://schemas.microsoft.com/office/word/2023/wordml/word16du" xmlns:w16sdtdh="http://schemas.microsoft.com/office/word/2020/wordml/sdtdatahash" xmlns:w16sdtfl="http://schemas.microsoft.com/office/word/2024/wordml/sdtformatlock" xmlns:w16se="http://schemas.microsoft.com/office/word/2015/wordml/symex" xmlns:wpg="http://schemas.microsoft.com/office/word/2010/wordprocessingGroup" xmlns:wpi="http://schemas.microsoft.com/office/word/2010/wordprocessingInk" xmlns:wne="http://schemas.microsoft.com/office/word/2006/wordml" xmlns:wps="http://schemas.microsoft.com/office/word/2010/wordprocessingShape" mc:Ignorable="w14 w15 w16se w16cid w16 w16cex w16sdtdh w16sdtfl w16du wp14">
   <w:footnote w:type="separator" w:id="-1">
     <w:p>
       <w:r>
@@ -572,7 +615,7 @@
 </file>
 
 <file path=word/header1.xml><?xml version="1.0" encoding="utf-8"?>
-<w:hdr xmlns:wpc="http://schemas.microsoft.com/office/word/2010/wordprocessingCanvas" xmlns:cx="http://schemas.microsoft.com/office/drawing/2014/chartex" xmlns:cx1="http://schemas.microsoft.com/office/drawing/2015/9/8/chartex" xmlns:cx2="http://schemas.microsoft.com/office/drawing/2015/10/21/chartex" xmlns:cx3="http://schemas.microsoft.com/office/drawing/2016/5/9/chartex" xmlns:cx4="http://schemas.microsoft.com/office/drawing/2016/5/10/chartex" xmlns:cx5="http://schemas.microsoft.com/office/drawing/2016/5/11/chartex" xmlns:cx6="http://schemas.microsoft.com/office/drawing/2016/5/12/chartex" xmlns:cx7="http://schemas.microsoft.com/office/drawing/2016/5/13/chartex" xmlns:cx8="http://schemas.microsoft.com/office/drawing/2016/5/14/chartex" xmlns:mc="http://schemas.openxmlformats.org/markup-compatibility/2006" xmlns:aink="http://schemas.microsoft.com/office/drawing/2016/ink" xmlns:am3d="http://schemas.microsoft.com/office/drawing/2017/model3d" xmlns:o="urn:schemas-microsoft-com:office:office" xmlns:r="http://schemas.openxmlformats.org/officeDocument/2006/relationships" xmlns:m="http://schemas.openxmlformats.org/officeDocument/2006/math" xmlns:v="urn:schemas-microsoft-com:vml" xmlns:wp14="http://schemas.microsoft.com/office/word/2010/wordprocessingDrawing" xmlns:wp="http://schemas.openxmlformats.org/drawingml/2006/wordprocessingDrawing" xmlns:w10="urn:schemas-microsoft-com:office:word" xmlns:w="http://schemas.openxmlformats.org/wordprocessingml/2006/main" xmlns:w14="http://schemas.microsoft.com/office/word/2010/wordml" xmlns:w15="http://schemas.microsoft.com/office/word/2012/wordml" xmlns:w16cid="http://schemas.microsoft.com/office/word/2016/wordml/cid" xmlns:w16se="http://schemas.microsoft.com/office/word/2015/wordml/symex" xmlns:wpg="http://schemas.microsoft.com/office/word/2010/wordprocessingGroup" xmlns:wpi="http://schemas.microsoft.com/office/word/2010/wordprocessingInk" xmlns:wne="http://schemas.microsoft.com/office/word/2006/wordml" xmlns:wps="http://schemas.microsoft.com/office/word/2010/wordprocessingShape" mc:Ignorable="w14 w15 w16se w16cid wp14">
+<w:hdr xmlns:wpc="http://schemas.microsoft.com/office/word/2010/wordprocessingCanvas" xmlns:cx="http://schemas.microsoft.com/office/drawing/2014/chartex" xmlns:cx1="http://schemas.microsoft.com/office/drawing/2015/9/8/chartex" xmlns:cx2="http://schemas.microsoft.com/office/drawing/2015/10/21/chartex" xmlns:cx3="http://schemas.microsoft.com/office/drawing/2016/5/9/chartex" xmlns:cx4="http://schemas.microsoft.com/office/drawing/2016/5/10/chartex" xmlns:cx5="http://schemas.microsoft.com/office/drawing/2016/5/11/chartex" xmlns:cx6="http://schemas.microsoft.com/office/drawing/2016/5/12/chartex" xmlns:cx7="http://schemas.microsoft.com/office/drawing/2016/5/13/chartex" xmlns:cx8="http://schemas.microsoft.com/office/drawing/2016/5/14/chartex" xmlns:mc="http://schemas.openxmlformats.org/markup-compatibility/2006" xmlns:aink="http://schemas.microsoft.com/office/drawing/2016/ink" xmlns:am3d="http://schemas.microsoft.com/office/drawing/2017/model3d" xmlns:o="urn:schemas-microsoft-com:office:office" xmlns:oel="http://schemas.microsoft.com/office/2019/extlst" xmlns:r="http://schemas.openxmlformats.org/officeDocument/2006/relationships" xmlns:m="http://schemas.openxmlformats.org/officeDocument/2006/math" xmlns:v="urn:schemas-microsoft-com:vml" xmlns:wp14="http://schemas.microsoft.com/office/word/2010/wordprocessingDrawing" xmlns:wp="http://schemas.openxmlformats.org/drawingml/2006/wordprocessingDrawing" xmlns:w10="urn:schemas-microsoft-com:office:word" xmlns:w="http://schemas.openxmlformats.org/wordprocessingml/2006/main" xmlns:w14="http://schemas.microsoft.com/office/word/2010/wordml" xmlns:w15="http://schemas.microsoft.com/office/word/2012/wordml" xmlns:w16cex="http://schemas.microsoft.com/office/word/2018/wordml/cex" xmlns:w16cid="http://schemas.microsoft.com/office/word/2016/wordml/cid" xmlns:w16="http://schemas.microsoft.com/office/word/2018/wordml" xmlns:w16du="http://schemas.microsoft.com/office/word/2023/wordml/word16du" xmlns:w16sdtdh="http://schemas.microsoft.com/office/word/2020/wordml/sdtdatahash" xmlns:w16sdtfl="http://schemas.microsoft.com/office/word/2024/wordml/sdtformatlock" xmlns:w16se="http://schemas.microsoft.com/office/word/2015/wordml/symex" xmlns:wpg="http://schemas.microsoft.com/office/word/2010/wordprocessingGroup" xmlns:wpi="http://schemas.microsoft.com/office/word/2010/wordprocessingInk" xmlns:wne="http://schemas.microsoft.com/office/word/2006/wordml" xmlns:wps="http://schemas.microsoft.com/office/word/2010/wordprocessingShape" mc:Ignorable="w14 w15 w16se w16cid w16 w16cex w16sdtdh w16sdtfl w16du wp14">
   <w:p>
     <w:pPr>
       <w:pStyle w:val="Header"/>
@@ -582,7 +625,7 @@
 </file>
 
 <file path=word/header2.xml><?xml version="1.0" encoding="utf-8"?>
-<w:hdr xmlns:wpc="http://schemas.microsoft.com/office/word/2010/wordprocessingCanvas" xmlns:cx="http://schemas.microsoft.com/office/drawing/2014/chartex" xmlns:cx1="http://schemas.microsoft.com/office/drawing/2015/9/8/chartex" xmlns:cx2="http://schemas.microsoft.com/office/drawing/2015/10/21/chartex" xmlns:cx3="http://schemas.microsoft.com/office/drawing/2016/5/9/chartex" xmlns:cx4="http://schemas.microsoft.com/office/drawing/2016/5/10/chartex" xmlns:cx5="http://schemas.microsoft.com/office/drawing/2016/5/11/chartex" xmlns:cx6="http://schemas.microsoft.com/office/drawing/2016/5/12/chartex" xmlns:cx7="http://schemas.microsoft.com/office/drawing/2016/5/13/chartex" xmlns:cx8="http://schemas.microsoft.com/office/drawing/2016/5/14/chartex" xmlns:mc="http://schemas.openxmlformats.org/markup-compatibility/2006" xmlns:aink="http://schemas.microsoft.com/office/drawing/2016/ink" xmlns:am3d="http://schemas.microsoft.com/office/drawing/2017/model3d" xmlns:o="urn:schemas-microsoft-com:office:office" xmlns:r="http://schemas.openxmlformats.org/officeDocument/2006/relationships" xmlns:m="http://schemas.openxmlformats.org/officeDocument/2006/math" xmlns:v="urn:schemas-microsoft-com:vml" xmlns:wp14="http://schemas.microsoft.com/office/word/2010/wordprocessingDrawing" xmlns:wp="http://schemas.openxmlformats.org/drawingml/2006/wordprocessingDrawing" xmlns:w10="urn:schemas-microsoft-com:office:word" xmlns:w="http://schemas.openxmlformats.org/wordprocessingml/2006/main" xmlns:w14="http://schemas.microsoft.com/office/word/2010/wordml" xmlns:w15="http://schemas.microsoft.com/office/word/2012/wordml" xmlns:w16cid="http://schemas.microsoft.com/office/word/2016/wordml/cid" xmlns:w16se="http://schemas.microsoft.com/office/word/2015/wordml/symex" xmlns:wpg="http://schemas.microsoft.com/office/word/2010/wordprocessingGroup" xmlns:wpi="http://schemas.microsoft.com/office/word/2010/wordprocessingInk" xmlns:wne="http://schemas.microsoft.com/office/word/2006/wordml" xmlns:wps="http://schemas.microsoft.com/office/word/2010/wordprocessingShape" mc:Ignorable="w14 w15 w16se w16cid wp14">
+<w:hdr xmlns:wpc="http://schemas.microsoft.com/office/word/2010/wordprocessingCanvas" xmlns:cx="http://schemas.microsoft.com/office/drawing/2014/chartex" xmlns:cx1="http://schemas.microsoft.com/office/drawing/2015/9/8/chartex" xmlns:cx2="http://schemas.microsoft.com/office/drawing/2015/10/21/chartex" xmlns:cx3="http://schemas.microsoft.com/office/drawing/2016/5/9/chartex" xmlns:cx4="http://schemas.microsoft.com/office/drawing/2016/5/10/chartex" xmlns:cx5="http://schemas.microsoft.com/office/drawing/2016/5/11/chartex" xmlns:cx6="http://schemas.microsoft.com/office/drawing/2016/5/12/chartex" xmlns:cx7="http://schemas.microsoft.com/office/drawing/2016/5/13/chartex" xmlns:cx8="http://schemas.microsoft.com/office/drawing/2016/5/14/chartex" xmlns:mc="http://schemas.openxmlformats.org/markup-compatibility/2006" xmlns:aink="http://schemas.microsoft.com/office/drawing/2016/ink" xmlns:am3d="http://schemas.microsoft.com/office/drawing/2017/model3d" xmlns:o="urn:schemas-microsoft-com:office:office" xmlns:oel="http://schemas.microsoft.com/office/2019/extlst" xmlns:r="http://schemas.openxmlformats.org/officeDocument/2006/relationships" xmlns:m="http://schemas.openxmlformats.org/officeDocument/2006/math" xmlns:v="urn:schemas-microsoft-com:vml" xmlns:wp14="http://schemas.microsoft.com/office/word/2010/wordprocessingDrawing" xmlns:wp="http://schemas.openxmlformats.org/drawingml/2006/wordprocessingDrawing" xmlns:w10="urn:schemas-microsoft-com:office:word" xmlns:w="http://schemas.openxmlformats.org/wordprocessingml/2006/main" xmlns:w14="http://schemas.microsoft.com/office/word/2010/wordml" xmlns:w15="http://schemas.microsoft.com/office/word/2012/wordml" xmlns:w16cex="http://schemas.microsoft.com/office/word/2018/wordml/cex" xmlns:w16cid="http://schemas.microsoft.com/office/word/2016/wordml/cid" xmlns:w16="http://schemas.microsoft.com/office/word/2018/wordml" xmlns:w16du="http://schemas.microsoft.com/office/word/2023/wordml/word16du" xmlns:w16sdtdh="http://schemas.microsoft.com/office/word/2020/wordml/sdtdatahash" xmlns:w16sdtfl="http://schemas.microsoft.com/office/word/2024/wordml/sdtformatlock" xmlns:w16se="http://schemas.microsoft.com/office/word/2015/wordml/symex" xmlns:wpg="http://schemas.microsoft.com/office/word/2010/wordprocessingGroup" xmlns:wpi="http://schemas.microsoft.com/office/word/2010/wordprocessingInk" xmlns:wne="http://schemas.microsoft.com/office/word/2006/wordml" xmlns:wps="http://schemas.microsoft.com/office/word/2010/wordprocessingShape" mc:Ignorable="w14 w15 w16se w16cid w16 w16cex w16sdtdh w16sdtfl w16du wp14">
   <w:sdt>
     <w:sdtPr>
       <w:id w:val="-1048988140"/>
@@ -591,7 +634,6 @@
         <w:docPartUnique/>
       </w:docPartObj>
     </w:sdtPr>
-    <w:sdtEndPr/>
     <w:sdtContent>
       <w:p>
         <w:pPr>
@@ -601,7 +643,7 @@
           <w:rPr>
             <w:noProof/>
           </w:rPr>
-          <w:pict>
+          <w:pict w14:anchorId="493D9419">
             <v:shapetype id="_x0000_t136" coordsize="21600,21600" o:spt="136" adj="10800" path="m@7,l@8,m@5,21600l@6,21600e">
               <v:formulas>
                 <v:f eqn="sum #0 0 10800"/>
@@ -626,7 +668,7 @@
               </v:handles>
               <o:lock v:ext="edit" text="t" shapetype="t"/>
             </v:shapetype>
-            <v:shape id="PowerPlusWaterMarkObject357831064" o:spid="_x0000_s2049" type="#_x0000_t136" style="position:absolute;margin-left:0;margin-top:0;width:412.4pt;height:247.45pt;rotation:315;z-index:-251658752;mso-position-horizontal:center;mso-position-horizontal-relative:margin;mso-position-vertical:center;mso-position-vertical-relative:margin" o:allowincell="f" fillcolor="silver" stroked="f">
+            <v:shape id="PowerPlusWaterMarkObject357831064" o:spid="_x0000_s1025" type="#_x0000_t136" style="position:absolute;margin-left:0;margin-top:0;width:412.4pt;height:247.45pt;rotation:315;z-index:-251658752;mso-position-horizontal:center;mso-position-horizontal-relative:margin;mso-position-vertical:center;mso-position-vertical-relative:margin" o:allowincell="f" fillcolor="silver" stroked="f">
               <v:fill opacity=".5"/>
               <v:textpath style="font-family:&quot;Calibri&quot;;font-size:1pt" string="DRAFT"/>
               <w10:wrap anchorx="margin" anchory="margin"/>
@@ -640,7 +682,7 @@
 </file>
 
 <file path=word/header3.xml><?xml version="1.0" encoding="utf-8"?>
-<w:hdr xmlns:wpc="http://schemas.microsoft.com/office/word/2010/wordprocessingCanvas" xmlns:cx="http://schemas.microsoft.com/office/drawing/2014/chartex" xmlns:cx1="http://schemas.microsoft.com/office/drawing/2015/9/8/chartex" xmlns:cx2="http://schemas.microsoft.com/office/drawing/2015/10/21/chartex" xmlns:cx3="http://schemas.microsoft.com/office/drawing/2016/5/9/chartex" xmlns:cx4="http://schemas.microsoft.com/office/drawing/2016/5/10/chartex" xmlns:cx5="http://schemas.microsoft.com/office/drawing/2016/5/11/chartex" xmlns:cx6="http://schemas.microsoft.com/office/drawing/2016/5/12/chartex" xmlns:cx7="http://schemas.microsoft.com/office/drawing/2016/5/13/chartex" xmlns:cx8="http://schemas.microsoft.com/office/drawing/2016/5/14/chartex" xmlns:mc="http://schemas.openxmlformats.org/markup-compatibility/2006" xmlns:aink="http://schemas.microsoft.com/office/drawing/2016/ink" xmlns:am3d="http://schemas.microsoft.com/office/drawing/2017/model3d" xmlns:o="urn:schemas-microsoft-com:office:office" xmlns:r="http://schemas.openxmlformats.org/officeDocument/2006/relationships" xmlns:m="http://schemas.openxmlformats.org/officeDocument/2006/math" xmlns:v="urn:schemas-microsoft-com:vml" xmlns:wp14="http://schemas.microsoft.com/office/word/2010/wordprocessingDrawing" xmlns:wp="http://schemas.openxmlformats.org/drawingml/2006/wordprocessingDrawing" xmlns:w10="urn:schemas-microsoft-com:office:word" xmlns:w="http://schemas.openxmlformats.org/wordprocessingml/2006/main" xmlns:w14="http://schemas.microsoft.com/office/word/2010/wordml" xmlns:w15="http://schemas.microsoft.com/office/word/2012/wordml" xmlns:w16cid="http://schemas.microsoft.com/office/word/2016/wordml/cid" xmlns:w16se="http://schemas.microsoft.com/office/word/2015/wordml/symex" xmlns:wpg="http://schemas.microsoft.com/office/word/2010/wordprocessingGroup" xmlns:wpi="http://schemas.microsoft.com/office/word/2010/wordprocessingInk" xmlns:wne="http://schemas.microsoft.com/office/word/2006/wordml" xmlns:wps="http://schemas.microsoft.com/office/word/2010/wordprocessingShape" mc:Ignorable="w14 w15 w16se w16cid wp14">
+<w:hdr xmlns:wpc="http://schemas.microsoft.com/office/word/2010/wordprocessingCanvas" xmlns:cx="http://schemas.microsoft.com/office/drawing/2014/chartex" xmlns:cx1="http://schemas.microsoft.com/office/drawing/2015/9/8/chartex" xmlns:cx2="http://schemas.microsoft.com/office/drawing/2015/10/21/chartex" xmlns:cx3="http://schemas.microsoft.com/office/drawing/2016/5/9/chartex" xmlns:cx4="http://schemas.microsoft.com/office/drawing/2016/5/10/chartex" xmlns:cx5="http://schemas.microsoft.com/office/drawing/2016/5/11/chartex" xmlns:cx6="http://schemas.microsoft.com/office/drawing/2016/5/12/chartex" xmlns:cx7="http://schemas.microsoft.com/office/drawing/2016/5/13/chartex" xmlns:cx8="http://schemas.microsoft.com/office/drawing/2016/5/14/chartex" xmlns:mc="http://schemas.openxmlformats.org/markup-compatibility/2006" xmlns:aink="http://schemas.microsoft.com/office/drawing/2016/ink" xmlns:am3d="http://schemas.microsoft.com/office/drawing/2017/model3d" xmlns:o="urn:schemas-microsoft-com:office:office" xmlns:oel="http://schemas.microsoft.com/office/2019/extlst" xmlns:r="http://schemas.openxmlformats.org/officeDocument/2006/relationships" xmlns:m="http://schemas.openxmlformats.org/officeDocument/2006/math" xmlns:v="urn:schemas-microsoft-com:vml" xmlns:wp14="http://schemas.microsoft.com/office/word/2010/wordprocessingDrawing" xmlns:wp="http://schemas.openxmlformats.org/drawingml/2006/wordprocessingDrawing" xmlns:w10="urn:schemas-microsoft-com:office:word" xmlns:w="http://schemas.openxmlformats.org/wordprocessingml/2006/main" xmlns:w14="http://schemas.microsoft.com/office/word/2010/wordml" xmlns:w15="http://schemas.microsoft.com/office/word/2012/wordml" xmlns:w16cex="http://schemas.microsoft.com/office/word/2018/wordml/cex" xmlns:w16cid="http://schemas.microsoft.com/office/word/2016/wordml/cid" xmlns:w16="http://schemas.microsoft.com/office/word/2018/wordml" xmlns:w16du="http://schemas.microsoft.com/office/word/2023/wordml/word16du" xmlns:w16sdtdh="http://schemas.microsoft.com/office/word/2020/wordml/sdtdatahash" xmlns:w16sdtfl="http://schemas.microsoft.com/office/word/2024/wordml/sdtformatlock" xmlns:w16se="http://schemas.microsoft.com/office/word/2015/wordml/symex" xmlns:wpg="http://schemas.microsoft.com/office/word/2010/wordprocessingGroup" xmlns:wpi="http://schemas.microsoft.com/office/word/2010/wordprocessingInk" xmlns:wne="http://schemas.microsoft.com/office/word/2006/wordml" xmlns:wps="http://schemas.microsoft.com/office/word/2010/wordprocessingShape" mc:Ignorable="w14 w15 w16se w16cid w16 w16cex w16sdtdh w16sdtfl w16du wp14">
   <w:p>
     <w:pPr>
       <w:pStyle w:val="Header"/>
@@ -650,7 +692,7 @@
 </file>
 
 <file path=word/numbering.xml><?xml version="1.0" encoding="utf-8"?>
-<w:numbering xmlns:wpc="http://schemas.microsoft.com/office/word/2010/wordprocessingCanvas" xmlns:cx="http://schemas.microsoft.com/office/drawing/2014/chartex" xmlns:cx1="http://schemas.microsoft.com/office/drawing/2015/9/8/chartex" xmlns:cx2="http://schemas.microsoft.com/office/drawing/2015/10/21/chartex" xmlns:cx3="http://schemas.microsoft.com/office/drawing/2016/5/9/chartex" xmlns:cx4="http://schemas.microsoft.com/office/drawing/2016/5/10/chartex" xmlns:cx5="http://schemas.microsoft.com/office/drawing/2016/5/11/chartex" xmlns:cx6="http://schemas.microsoft.com/office/drawing/2016/5/12/chartex" xmlns:cx7="http://schemas.microsoft.com/office/drawing/2016/5/13/chartex" xmlns:cx8="http://schemas.microsoft.com/office/drawing/2016/5/14/chartex" xmlns:mc="http://schemas.openxmlformats.org/markup-compatibility/2006" xmlns:aink="http://schemas.microsoft.com/office/drawing/2016/ink" xmlns:am3d="http://schemas.microsoft.com/office/drawing/2017/model3d" xmlns:o="urn:schemas-microsoft-com:office:office" xmlns:r="http://schemas.openxmlformats.org/officeDocument/2006/relationships" xmlns:m="http://schemas.openxmlformats.org/officeDocument/2006/math" xmlns:v="urn:schemas-microsoft-com:vml" xmlns:wp14="http://schemas.microsoft.com/office/word/2010/wordprocessingDrawing" xmlns:wp="http://schemas.openxmlformats.org/drawingml/2006/wordprocessingDrawing" xmlns:w10="urn:schemas-microsoft-com:office:word" xmlns:w="http://schemas.openxmlformats.org/wordprocessingml/2006/main" xmlns:w14="http://schemas.microsoft.com/office/word/2010/wordml" xmlns:w15="http://schemas.microsoft.com/office/word/2012/wordml" xmlns:w16cid="http://schemas.microsoft.com/office/word/2016/wordml/cid" xmlns:w16se="http://schemas.microsoft.com/office/word/2015/wordml/symex" xmlns:wpg="http://schemas.microsoft.com/office/word/2010/wordprocessingGroup" xmlns:wpi="http://schemas.microsoft.com/office/word/2010/wordprocessingInk" xmlns:wne="http://schemas.microsoft.com/office/word/2006/wordml" xmlns:wps="http://schemas.microsoft.com/office/word/2010/wordprocessingShape" mc:Ignorable="w14 w15 w16se w16cid wp14">
+<w:numbering xmlns:wpc="http://schemas.microsoft.com/office/word/2010/wordprocessingCanvas" xmlns:cx="http://schemas.microsoft.com/office/drawing/2014/chartex" xmlns:cx1="http://schemas.microsoft.com/office/drawing/2015/9/8/chartex" xmlns:cx2="http://schemas.microsoft.com/office/drawing/2015/10/21/chartex" xmlns:cx3="http://schemas.microsoft.com/office/drawing/2016/5/9/chartex" xmlns:cx4="http://schemas.microsoft.com/office/drawing/2016/5/10/chartex" xmlns:cx5="http://schemas.microsoft.com/office/drawing/2016/5/11/chartex" xmlns:cx6="http://schemas.microsoft.com/office/drawing/2016/5/12/chartex" xmlns:cx7="http://schemas.microsoft.com/office/drawing/2016/5/13/chartex" xmlns:cx8="http://schemas.microsoft.com/office/drawing/2016/5/14/chartex" xmlns:mc="http://schemas.openxmlformats.org/markup-compatibility/2006" xmlns:aink="http://schemas.microsoft.com/office/drawing/2016/ink" xmlns:am3d="http://schemas.microsoft.com/office/drawing/2017/model3d" xmlns:o="urn:schemas-microsoft-com:office:office" xmlns:oel="http://schemas.microsoft.com/office/2019/extlst" xmlns:r="http://schemas.openxmlformats.org/officeDocument/2006/relationships" xmlns:m="http://schemas.openxmlformats.org/officeDocument/2006/math" xmlns:v="urn:schemas-microsoft-com:vml" xmlns:wp14="http://schemas.microsoft.com/office/word/2010/wordprocessingDrawing" xmlns:wp="http://schemas.openxmlformats.org/drawingml/2006/wordprocessingDrawing" xmlns:w10="urn:schemas-microsoft-com:office:word" xmlns:w="http://schemas.openxmlformats.org/wordprocessingml/2006/main" xmlns:w14="http://schemas.microsoft.com/office/word/2010/wordml" xmlns:w15="http://schemas.microsoft.com/office/word/2012/wordml" xmlns:w16cex="http://schemas.microsoft.com/office/word/2018/wordml/cex" xmlns:w16cid="http://schemas.microsoft.com/office/word/2016/wordml/cid" xmlns:w16="http://schemas.microsoft.com/office/word/2018/wordml" xmlns:w16du="http://schemas.microsoft.com/office/word/2023/wordml/word16du" xmlns:w16sdtdh="http://schemas.microsoft.com/office/word/2020/wordml/sdtdatahash" xmlns:w16sdtfl="http://schemas.microsoft.com/office/word/2024/wordml/sdtformatlock" xmlns:w16se="http://schemas.microsoft.com/office/word/2015/wordml/symex" xmlns:wpg="http://schemas.microsoft.com/office/word/2010/wordprocessingGroup" xmlns:wpi="http://schemas.microsoft.com/office/word/2010/wordprocessingInk" xmlns:wne="http://schemas.microsoft.com/office/word/2006/wordml" xmlns:wps="http://schemas.microsoft.com/office/word/2010/wordprocessingShape" mc:Ignorable="w14 w15 w16se w16cid w16 w16cex w16sdtdh w16sdtfl w16du wp14">
   <w:abstractNum w:abstractNumId="0" w15:restartNumberingAfterBreak="0">
     <w:nsid w:val="EA454B4C"/>
     <w:multiLevelType w:val="multilevel"/>
@@ -990,53 +1032,53 @@
       </w:pPr>
     </w:lvl>
   </w:abstractNum>
-  <w:num w:numId="1">
+  <w:num w:numId="1" w16cid:durableId="1389454276">
     <w:abstractNumId w:val="11"/>
   </w:num>
-  <w:num w:numId="2">
+  <w:num w:numId="2" w16cid:durableId="2132430709">
     <w:abstractNumId w:val="0"/>
   </w:num>
-  <w:num w:numId="3">
+  <w:num w:numId="3" w16cid:durableId="786242779">
     <w:abstractNumId w:val="0"/>
   </w:num>
-  <w:num w:numId="4">
+  <w:num w:numId="4" w16cid:durableId="411049062">
     <w:abstractNumId w:val="0"/>
   </w:num>
-  <w:num w:numId="5">
+  <w:num w:numId="5" w16cid:durableId="1529952439">
     <w:abstractNumId w:val="10"/>
   </w:num>
-  <w:num w:numId="6">
+  <w:num w:numId="6" w16cid:durableId="2102334776">
     <w:abstractNumId w:val="8"/>
   </w:num>
-  <w:num w:numId="7">
+  <w:num w:numId="7" w16cid:durableId="981664087">
     <w:abstractNumId w:val="7"/>
   </w:num>
-  <w:num w:numId="8">
+  <w:num w:numId="8" w16cid:durableId="595286478">
     <w:abstractNumId w:val="6"/>
   </w:num>
-  <w:num w:numId="9">
+  <w:num w:numId="9" w16cid:durableId="1687052682">
     <w:abstractNumId w:val="5"/>
   </w:num>
-  <w:num w:numId="10">
+  <w:num w:numId="10" w16cid:durableId="513541085">
     <w:abstractNumId w:val="9"/>
   </w:num>
-  <w:num w:numId="11">
+  <w:num w:numId="11" w16cid:durableId="829564806">
     <w:abstractNumId w:val="4"/>
   </w:num>
-  <w:num w:numId="12">
+  <w:num w:numId="12" w16cid:durableId="97605999">
     <w:abstractNumId w:val="3"/>
   </w:num>
-  <w:num w:numId="13">
+  <w:num w:numId="13" w16cid:durableId="878278648">
     <w:abstractNumId w:val="2"/>
   </w:num>
-  <w:num w:numId="14">
+  <w:num w:numId="14" w16cid:durableId="1924338045">
     <w:abstractNumId w:val="1"/>
   </w:num>
 </w:numbering>
 </file>
 
 <file path=word/styles.xml><?xml version="1.0" encoding="utf-8"?>
-<w:styles xmlns:mc="http://schemas.openxmlformats.org/markup-compatibility/2006" xmlns:r="http://schemas.openxmlformats.org/officeDocument/2006/relationships" xmlns:w="http://schemas.openxmlformats.org/wordprocessingml/2006/main" xmlns:w14="http://schemas.microsoft.com/office/word/2010/wordml" xmlns:w15="http://schemas.microsoft.com/office/word/2012/wordml" xmlns:w16cid="http://schemas.microsoft.com/office/word/2016/wordml/cid" xmlns:w16se="http://schemas.microsoft.com/office/word/2015/wordml/symex" mc:Ignorable="w14 w15 w16se w16cid">
+<w:styles xmlns:mc="http://schemas.openxmlformats.org/markup-compatibility/2006" xmlns:r="http://schemas.openxmlformats.org/officeDocument/2006/relationships" xmlns:w="http://schemas.openxmlformats.org/wordprocessingml/2006/main" xmlns:w14="http://schemas.microsoft.com/office/word/2010/wordml" xmlns:w15="http://schemas.microsoft.com/office/word/2012/wordml" xmlns:w16cex="http://schemas.microsoft.com/office/word/2018/wordml/cex" xmlns:w16cid="http://schemas.microsoft.com/office/word/2016/wordml/cid" xmlns:w16="http://schemas.microsoft.com/office/word/2018/wordml" xmlns:w16du="http://schemas.microsoft.com/office/word/2023/wordml/word16du" xmlns:w16sdtdh="http://schemas.microsoft.com/office/word/2020/wordml/sdtdatahash" xmlns:w16sdtfl="http://schemas.microsoft.com/office/word/2024/wordml/sdtformatlock" xmlns:w16se="http://schemas.microsoft.com/office/word/2015/wordml/symex" mc:Ignorable="w14 w15 w16se w16cid w16 w16cex w16sdtdh w16sdtfl w16du">
   <w:docDefaults>
     <w:rPrDefault>
       <w:rPr>
@@ -1052,7 +1094,7 @@
       </w:pPr>
     </w:pPrDefault>
   </w:docDefaults>
-  <w:latentStyles w:defLockedState="0" w:defUIPriority="0" w:defSemiHidden="0" w:defUnhideWhenUsed="0" w:defQFormat="0" w:count="375">
+  <w:latentStyles w:defLockedState="0" w:defUIPriority="0" w:defSemiHidden="0" w:defUnhideWhenUsed="0" w:defQFormat="0" w:count="376">
     <w:lsdException w:name="heading 6" w:semiHidden="1" w:unhideWhenUsed="1"/>
     <w:lsdException w:name="index 3" w:semiHidden="1" w:unhideWhenUsed="1"/>
     <w:lsdException w:name="index 4" w:semiHidden="1" w:unhideWhenUsed="1"/>
@@ -1387,6 +1429,7 @@
     <w:lsdException w:name="Smart Hyperlink" w:semiHidden="1" w:uiPriority="99" w:unhideWhenUsed="1"/>
     <w:lsdException w:name="Hashtag" w:semiHidden="1" w:uiPriority="99" w:unhideWhenUsed="1"/>
     <w:lsdException w:name="Unresolved Mention" w:semiHidden="1" w:uiPriority="99" w:unhideWhenUsed="1"/>
+    <w:lsdException w:name="Smart Link" w:semiHidden="1" w:uiPriority="99" w:unhideWhenUsed="1"/>
   </w:latentStyles>
   <w:style w:type="paragraph" w:default="1" w:styleId="Normal">
     <w:name w:val="Normal"/>
@@ -2209,6 +2252,33 @@
     <w:semiHidden/>
     <w:unhideWhenUsed/>
     <w:rsid w:val="00C446BA"/>
+  </w:style>
+  <w:style w:type="paragraph" w:customStyle="1" w:styleId="text-box">
+    <w:name w:val="text-box"/>
+    <w:basedOn w:val="Normal"/>
+    <w:link w:val="text-boxChar"/>
+    <w:qFormat/>
+    <w:rsid w:val="0069168A"/>
+    <w:pPr>
+      <w:pBdr>
+        <w:top w:val="single" w:sz="4" w:space="1" w:color="auto"/>
+        <w:left w:val="single" w:sz="4" w:space="4" w:color="auto"/>
+        <w:bottom w:val="single" w:sz="4" w:space="1" w:color="auto"/>
+        <w:right w:val="single" w:sz="4" w:space="4" w:color="auto"/>
+      </w:pBdr>
+    </w:pPr>
+    <w:rPr>
+      <w:rFonts w:ascii="Times New Roman" w:hAnsi="Times New Roman"/>
+    </w:rPr>
+  </w:style>
+  <w:style w:type="character" w:customStyle="1" w:styleId="text-boxChar">
+    <w:name w:val="text-box Char"/>
+    <w:basedOn w:val="DefaultParagraphFont"/>
+    <w:link w:val="text-box"/>
+    <w:rsid w:val="0069168A"/>
+    <w:rPr>
+      <w:rFonts w:ascii="Times New Roman" w:hAnsi="Times New Roman"/>
+    </w:rPr>
   </w:style>
 </w:styles>
 </file>
@@ -2529,4 +2599,10 @@
   </a:objectDefaults>
   <a:extraClrSchemeLst/>
 </a:theme>
+</file>
+
+<file path=docMetadata/LabelInfo.xml><?xml version="1.0" encoding="utf-8"?>
+<clbl:labelList xmlns:clbl="http://schemas.microsoft.com/office/2020/mipLabelMetadata">
+  <clbl:label id="{37f4b8a2-ad4f-41b5-9a91-284d2cc38f56}" enabled="1" method="Standard" siteId="{70de1992-07c6-480f-a318-a1afcba03983}" contentBits="0" removed="0"/>
+</clbl:labelList>
 </file>
</xml_diff>